<commit_message>
fix(HCO ROM): remove fabricated quarterly-audit and 90-day boilerplate across ROM.1-6, add missing ROM.6.a annual risk-plan review requirement, fix ROM.6 filename trailing space
</commit_message>
<xml_diff>
--- a/policies/build/rewrite_reference/HCO_ROM_1_v2_REWRITE_DRAFT.docx
+++ b/policies/build/rewrite_reference/HCO_ROM_1_v2_REWRITE_DRAFT.docx
@@ -783,7 +783,7 @@
           <w:p>
             <w:r/>
             <w:r>
-              <w:t>Audits this policy every quarter; keeps training records; supports dashboards and committee reviews.</w:t>
+              <w:t>Audits this policy periodically; keeps training records; supports dashboards and committee reviews.</w:t>
             </w:r>
           </w:p>
         </w:tc>
@@ -824,12 +824,12 @@
     </w:p>
     <w:p>
       <w:r>
-        <w:t>The Quality Coordinator audits this policy every quarter, checking a sample of records against the steps in Section 5, confirming documentary evidence is on file for each asterisked objective element in the sample (marked * in the Level column of Section 11), and confirming the CORE objective element shows no critical gaps.</w:t>
+        <w:t>The Quality Coordinator audits this policy periodically, checking a sample of records against the steps in Section 5, confirming documentary evidence is on file for each asterisked objective element in the sample (marked * in the Level column of Section 11), and confirming the CORE objective element shows no critical gaps.</w:t>
       </w:r>
     </w:p>
     <w:p>
       <w:r>
-        <w:t>If an audit finds a gap that is still open after 90 days, the hospital carries out a root-cause analysis. This policy itself is reviewed every year, and sooner if there is a change in the governing body, its terms of reference, or the hospital's vision, mission or values.</w:t>
+        <w:t>If an audit finds a gap that is still open after a defined timeframe, the hospital carries out a root-cause analysis. This policy itself is reviewed every year, and sooner if there is a change in the governing body, its terms of reference, or the hospital's vision, mission or values.</w:t>
       </w:r>
     </w:p>
     <w:p>

</xml_diff>